<commit_message>
Fase 08.3: importar plantillas desde Word y «Mi CV»
- jh templates inspect | build-docx | validate | preview: párrafos
  numerados con fragmentos fusionados, secciones en su orden, capacity
  medida en el original y estimación de ATS; mapeo comprobado con el
  perfil demo antes de tocar el Word y render en sandbox.
- extra_sections en perfil, CvContent, contrato y plantillas integradas.
- «Mi CV» en Plantillas: subida a data/uploads/, original y preview con
  el perfil real, «Usar por defecto» (ruamel.yaml, conserva comentarios)
  y etiqueta «Tu CV».
- Skills importar-plantilla-cv y actualizar-perfil, roles redactor y
  verificador, docs y guía de prueba manual. Cierra la fase 08.

Co-Authored-By: Claude Opus 5.5 <noreply@anthropic.com>
</commit_message>
<xml_diff>
--- a/templates/ats-simple/template.docx
+++ b/templates/ats-simple/template.docx
@@ -350,6 +350,67 @@
     </w:p>
     <w:p>
       <w:r>
+        <w:t>{%p if show.extra_sections %}</w:t>
+      </w:r>
+    </w:p>
+    <w:p>
+      <w:r>
+        <w:t>{%p for x in extra_sections %}</w:t>
+      </w:r>
+    </w:p>
+    <w:p>
+      <w:pPr>
+        <w:spacing w:before="160" w:after="60"/>
+        <w:pBdr>
+          <w:bottom w:val="single" w:sz="4" w:space="1" w:color="808080"/>
+        </w:pBdr>
+      </w:pPr>
+      <w:r>
+        <w:rPr>
+          <w:b/>
+          <w:sz w:val="22"/>
+        </w:rPr>
+        <w:t>{{ x.title|upper }}</w:t>
+      </w:r>
+    </w:p>
+    <w:p>
+      <w:r>
+        <w:t>{%p for i in x.items %}</w:t>
+      </w:r>
+    </w:p>
+    <w:p>
+      <w:pPr>
+        <w:pStyle w:val="ListBullet"/>
+      </w:pPr>
+      <w:r>
+        <w:rPr/>
+        <w:t>{{ i.text }}</w:t>
+      </w:r>
+      <w:r>
+        <w:rPr>
+          <w:color w:val="555555"/>
+          <w:sz w:val="19"/>
+        </w:rPr>
+        <w:t>{% if i.date %} · {{ i.date }}{% endif %}</w:t>
+      </w:r>
+    </w:p>
+    <w:p>
+      <w:r>
+        <w:t>{%p endfor %}</w:t>
+      </w:r>
+    </w:p>
+    <w:p>
+      <w:r>
+        <w:t>{%p endfor %}</w:t>
+      </w:r>
+    </w:p>
+    <w:p>
+      <w:r>
+        <w:t>{%p endif %}</w:t>
+      </w:r>
+    </w:p>
+    <w:p>
+      <w:r>
         <w:t>{%p if show.skills %}</w:t>
       </w:r>
     </w:p>

</xml_diff>